<commit_message>
Cleanup: remove sample SRS, duplicate docx, build artifacts, pycache, Vite defaults
</commit_message>
<xml_diff>
--- a/docs/phase2_eval/SRS_AquaIQ.docx
+++ b/docs/phase2_eval/SRS_AquaIQ.docx
@@ -1818,6 +1818,36 @@
       </w:r>
       <w:r>
         <w:t xml:space="preserve">- Validate against local monitoring data</w:t>
+      </w:r>
+    </w:p>
+    <w:p>
+      <w:pPr>
+        <w:pStyle w:val="BodyText"/>
+      </w:pPr>
+      <w:r>
+        <w:rPr>
+          <w:b/>
+          <w:bCs/>
+        </w:rPr>
+        <w:t xml:space="preserve">General Public / Citizen</w:t>
+      </w:r>
+      <w:r>
+        <w:t xml:space="preserve"> </w:t>
+      </w:r>
+      <w:r>
+        <w:t xml:space="preserve">- View district-level groundwater availability and forecasts</w:t>
+      </w:r>
+      <w:r>
+        <w:t xml:space="preserve"> </w:t>
+      </w:r>
+      <w:r>
+        <w:t xml:space="preserve">- Access public maps to understand local water crisis risk</w:t>
+      </w:r>
+      <w:r>
+        <w:t xml:space="preserve"> </w:t>
+      </w:r>
+      <w:r>
+        <w:t xml:space="preserve">- Download publicly available reports</w:t>
       </w:r>
     </w:p>
     <w:bookmarkEnd w:id="20"/>

</xml_diff>